<commit_message>
Fix reports (lab_05 and lab_06)
</commit_message>
<xml_diff>
--- a/lab_05/Отчет/ИУ7-31Б_Постнов_Степан_лр_5.docx
+++ b/lab_05/Отчет/ИУ7-31Б_Постнов_Степан_лр_5.docx
@@ -1053,7 +1053,7 @@
             </w:rPr>
             <w:fldChar w:fldCharType="separate"/>
           </w:r>
-          <w:hyperlink w:anchor="_Toc120448059" w:history="1">
+          <w:hyperlink w:anchor="_Toc120484665" w:history="1">
             <w:r>
               <w:rPr>
                 <w:rStyle w:val="a3"/>
@@ -1092,7 +1092,7 @@
                 <w:sz w:val="28"/>
                 <w:szCs w:val="28"/>
               </w:rPr>
-              <w:instrText xml:space="preserve"> PAGEREF _Toc120448059 \h </w:instrText>
+              <w:instrText xml:space="preserve"> PAGEREF _Toc120484665 \h </w:instrText>
             </w:r>
             <w:r>
               <w:rPr>
@@ -1149,7 +1149,7 @@
               <w:lang w:eastAsia="ru-RU"/>
             </w:rPr>
           </w:pPr>
-          <w:hyperlink w:anchor="_Toc120448060" w:history="1">
+          <w:hyperlink w:anchor="_Toc120484666" w:history="1">
             <w:r>
               <w:rPr>
                 <w:rStyle w:val="a3"/>
@@ -1188,7 +1188,7 @@
                 <w:sz w:val="28"/>
                 <w:szCs w:val="28"/>
               </w:rPr>
-              <w:instrText xml:space="preserve"> PAGEREF _Toc120448060 \h </w:instrText>
+              <w:instrText xml:space="preserve"> PAGEREF _Toc120484666 \h </w:instrText>
             </w:r>
             <w:r>
               <w:rPr>
@@ -1243,7 +1243,7 @@
               <w:szCs w:val="28"/>
             </w:rPr>
           </w:pPr>
-          <w:hyperlink w:anchor="_Toc120448061" w:history="1">
+          <w:hyperlink w:anchor="_Toc120484667" w:history="1">
             <w:r>
               <w:rPr>
                 <w:rStyle w:val="a3"/>
@@ -1274,7 +1274,7 @@
                 <w:webHidden/>
                 <w:szCs w:val="28"/>
               </w:rPr>
-              <w:instrText xml:space="preserve"> PAGEREF _Toc120448061 \h </w:instrText>
+              <w:instrText xml:space="preserve"> PAGEREF _Toc120484667 \h </w:instrText>
             </w:r>
             <w:r>
               <w:rPr>
@@ -1321,7 +1321,7 @@
               <w:szCs w:val="28"/>
             </w:rPr>
           </w:pPr>
-          <w:hyperlink w:anchor="_Toc120448062" w:history="1">
+          <w:hyperlink w:anchor="_Toc120484668" w:history="1">
             <w:r>
               <w:rPr>
                 <w:rStyle w:val="a3"/>
@@ -1352,7 +1352,7 @@
                 <w:webHidden/>
                 <w:szCs w:val="28"/>
               </w:rPr>
-              <w:instrText xml:space="preserve"> PAGEREF _Toc120448062 \h </w:instrText>
+              <w:instrText xml:space="preserve"> PAGEREF _Toc120484668 \h </w:instrText>
             </w:r>
             <w:r>
               <w:rPr>
@@ -1399,7 +1399,7 @@
               <w:szCs w:val="28"/>
             </w:rPr>
           </w:pPr>
-          <w:hyperlink w:anchor="_Toc120448063" w:history="1">
+          <w:hyperlink w:anchor="_Toc120484669" w:history="1">
             <w:r>
               <w:rPr>
                 <w:rStyle w:val="a3"/>
@@ -1430,7 +1430,7 @@
                 <w:webHidden/>
                 <w:szCs w:val="28"/>
               </w:rPr>
-              <w:instrText xml:space="preserve"> PAGEREF _Toc120448063 \h </w:instrText>
+              <w:instrText xml:space="preserve"> PAGEREF _Toc120484669 \h </w:instrText>
             </w:r>
             <w:r>
               <w:rPr>
@@ -1477,7 +1477,7 @@
               <w:szCs w:val="28"/>
             </w:rPr>
           </w:pPr>
-          <w:hyperlink w:anchor="_Toc120448064" w:history="1">
+          <w:hyperlink w:anchor="_Toc120484670" w:history="1">
             <w:r>
               <w:rPr>
                 <w:rStyle w:val="a3"/>
@@ -1508,7 +1508,7 @@
                 <w:webHidden/>
                 <w:szCs w:val="28"/>
               </w:rPr>
-              <w:instrText xml:space="preserve"> PAGEREF _Toc120448064 \h </w:instrText>
+              <w:instrText xml:space="preserve"> PAGEREF _Toc120484670 \h </w:instrText>
             </w:r>
             <w:r>
               <w:rPr>
@@ -1555,7 +1555,7 @@
               <w:szCs w:val="28"/>
             </w:rPr>
           </w:pPr>
-          <w:hyperlink w:anchor="_Toc120448065" w:history="1">
+          <w:hyperlink w:anchor="_Toc120484671" w:history="1">
             <w:r>
               <w:rPr>
                 <w:rStyle w:val="a3"/>
@@ -1586,7 +1586,7 @@
                 <w:webHidden/>
                 <w:szCs w:val="28"/>
               </w:rPr>
-              <w:instrText xml:space="preserve"> PAGEREF _Toc120448065 \h </w:instrText>
+              <w:instrText xml:space="preserve"> PAGEREF _Toc120484671 \h </w:instrText>
             </w:r>
             <w:r>
               <w:rPr>
@@ -1635,7 +1635,7 @@
               <w:lang w:eastAsia="ru-RU"/>
             </w:rPr>
           </w:pPr>
-          <w:hyperlink w:anchor="_Toc120448066" w:history="1">
+          <w:hyperlink w:anchor="_Toc120484672" w:history="1">
             <w:r>
               <w:rPr>
                 <w:rStyle w:val="a3"/>
@@ -1674,7 +1674,7 @@
                 <w:sz w:val="28"/>
                 <w:szCs w:val="28"/>
               </w:rPr>
-              <w:instrText xml:space="preserve"> PAGEREF _Toc120448066 \h </w:instrText>
+              <w:instrText xml:space="preserve"> PAGEREF _Toc120484672 \h </w:instrText>
             </w:r>
             <w:r>
               <w:rPr>
@@ -1731,7 +1731,7 @@
               <w:lang w:eastAsia="ru-RU"/>
             </w:rPr>
           </w:pPr>
-          <w:hyperlink w:anchor="_Toc120448067" w:history="1">
+          <w:hyperlink w:anchor="_Toc120484673" w:history="1">
             <w:r>
               <w:rPr>
                 <w:rStyle w:val="a3"/>
@@ -1770,7 +1770,7 @@
                 <w:sz w:val="28"/>
                 <w:szCs w:val="28"/>
               </w:rPr>
-              <w:instrText xml:space="preserve"> PAGEREF _Toc120448067 \h </w:instrText>
+              <w:instrText xml:space="preserve"> PAGEREF _Toc120484673 \h </w:instrText>
             </w:r>
             <w:r>
               <w:rPr>
@@ -1827,7 +1827,7 @@
               <w:lang w:eastAsia="ru-RU"/>
             </w:rPr>
           </w:pPr>
-          <w:hyperlink w:anchor="_Toc120448068" w:history="1">
+          <w:hyperlink w:anchor="_Toc120484674" w:history="1">
             <w:r>
               <w:rPr>
                 <w:rStyle w:val="a3"/>
@@ -1836,7 +1836,7 @@
                 <w:sz w:val="28"/>
                 <w:szCs w:val="28"/>
               </w:rPr>
-              <w:t>Сравнение эффективности двух типов стеков при разных строках-выражениях</w:t>
+              <w:t>Сравнение эффективности двух типов очередей при разных операциях над ними</w:t>
             </w:r>
             <w:r>
               <w:rPr>
@@ -1866,7 +1866,7 @@
                 <w:sz w:val="28"/>
                 <w:szCs w:val="28"/>
               </w:rPr>
-              <w:instrText xml:space="preserve"> PAGEREF _Toc120448068 \h </w:instrText>
+              <w:instrText xml:space="preserve"> PAGEREF _Toc120484674 \h </w:instrText>
             </w:r>
             <w:r>
               <w:rPr>
@@ -1923,7 +1923,7 @@
               <w:lang w:eastAsia="ru-RU"/>
             </w:rPr>
           </w:pPr>
-          <w:hyperlink w:anchor="_Toc120448069" w:history="1">
+          <w:hyperlink w:anchor="_Toc120484675" w:history="1">
             <w:r>
               <w:rPr>
                 <w:rStyle w:val="a3"/>
@@ -1962,7 +1962,7 @@
                 <w:sz w:val="28"/>
                 <w:szCs w:val="28"/>
               </w:rPr>
-              <w:instrText xml:space="preserve"> PAGEREF _Toc120448069 \h </w:instrText>
+              <w:instrText xml:space="preserve"> PAGEREF _Toc120484675 \h </w:instrText>
             </w:r>
             <w:r>
               <w:rPr>
@@ -2019,7 +2019,7 @@
               <w:lang w:eastAsia="ru-RU"/>
             </w:rPr>
           </w:pPr>
-          <w:hyperlink w:anchor="_Toc120448070" w:history="1">
+          <w:hyperlink w:anchor="_Toc120484676" w:history="1">
             <w:r>
               <w:rPr>
                 <w:rStyle w:val="a3"/>
@@ -2078,7 +2078,7 @@
                 <w:sz w:val="28"/>
                 <w:szCs w:val="28"/>
               </w:rPr>
-              <w:instrText xml:space="preserve"> PAGEREF _Toc120448070 \h </w:instrText>
+              <w:instrText xml:space="preserve"> PAGEREF _Toc120484676 \h </w:instrText>
             </w:r>
             <w:r>
               <w:rPr>
@@ -2190,7 +2190,7 @@
         </w:rPr>
       </w:pPr>
       <w:bookmarkStart w:id="2" w:name="__RefHeading___Toc1850_1830211148"/>
-      <w:bookmarkStart w:id="3" w:name="_Toc120448059"/>
+      <w:bookmarkStart w:id="3" w:name="_Toc120484665"/>
       <w:r>
         <w:rPr>
           <w:rFonts w:ascii="Times New Roman" w:hAnsi="Times New Roman"/>
@@ -2239,7 +2239,7 @@
           <w:szCs w:val="28"/>
         </w:rPr>
       </w:pPr>
-      <w:bookmarkStart w:id="5" w:name="_Toc120448060"/>
+      <w:bookmarkStart w:id="5" w:name="_Toc120484666"/>
       <w:r>
         <w:rPr>
           <w:rFonts w:ascii="Times New Roman" w:hAnsi="Times New Roman"/>
@@ -2257,7 +2257,7 @@
         <w:jc w:val="center"/>
       </w:pPr>
       <w:bookmarkStart w:id="6" w:name="__RefHeading___Toc1854_1830211148"/>
-      <w:bookmarkStart w:id="7" w:name="_Toc120448061"/>
+      <w:bookmarkStart w:id="7" w:name="_Toc120484667"/>
       <w:r>
         <w:rPr>
           <w:rFonts w:ascii="Times New Roman" w:hAnsi="Times New Roman"/>
@@ -2323,7 +2323,7 @@
           <w:szCs w:val="28"/>
         </w:rPr>
       </w:pPr>
-      <w:bookmarkStart w:id="8" w:name="_Toc120448062"/>
+      <w:bookmarkStart w:id="8" w:name="_Toc120484668"/>
       <w:r>
         <w:rPr>
           <w:rFonts w:ascii="Times New Roman" w:hAnsi="Times New Roman"/>
@@ -2532,7 +2532,7 @@
           <w:szCs w:val="28"/>
         </w:rPr>
       </w:pPr>
-      <w:bookmarkStart w:id="9" w:name="_Toc120448063"/>
+      <w:bookmarkStart w:id="9" w:name="_Toc120484669"/>
       <w:r>
         <w:rPr>
           <w:rFonts w:ascii="Times New Roman" w:hAnsi="Times New Roman"/>
@@ -2584,7 +2584,7 @@
           <w:szCs w:val="28"/>
         </w:rPr>
       </w:pPr>
-      <w:bookmarkStart w:id="10" w:name="_Toc120448064"/>
+      <w:bookmarkStart w:id="10" w:name="_Toc120484670"/>
       <w:r>
         <w:rPr>
           <w:rFonts w:ascii="Times New Roman" w:hAnsi="Times New Roman"/>
@@ -2650,7 +2650,7 @@
         </w:rPr>
       </w:pPr>
       <w:bookmarkStart w:id="11" w:name="__RefHeading___Toc1860_1830211148"/>
-      <w:bookmarkStart w:id="12" w:name="_Toc120448065"/>
+      <w:bookmarkStart w:id="12" w:name="_Toc120484671"/>
       <w:r>
         <w:rPr>
           <w:rFonts w:ascii="Times New Roman" w:hAnsi="Times New Roman"/>
@@ -2988,7 +2988,7 @@
         </w:rPr>
       </w:pPr>
       <w:bookmarkStart w:id="13" w:name="__RefHeading___Toc1862_1830211148"/>
-      <w:bookmarkStart w:id="14" w:name="_Toc120448066"/>
+      <w:bookmarkStart w:id="14" w:name="_Toc120484672"/>
       <w:r>
         <w:rPr>
           <w:rFonts w:ascii="Times New Roman" w:hAnsi="Times New Roman"/>
@@ -5599,7 +5599,7 @@
           <w:szCs w:val="28"/>
         </w:rPr>
       </w:pPr>
-      <w:bookmarkStart w:id="15" w:name="_Toc120448067"/>
+      <w:bookmarkStart w:id="15" w:name="_Toc120484673"/>
       <w:r>
         <w:rPr>
           <w:rFonts w:ascii="Times New Roman" w:hAnsi="Times New Roman"/>
@@ -5656,7 +5656,7 @@
           <w:szCs w:val="28"/>
         </w:rPr>
       </w:pPr>
-      <w:bookmarkStart w:id="16" w:name="_Toc120448068"/>
+      <w:bookmarkStart w:id="16" w:name="_Toc120484674"/>
       <w:r>
         <w:rPr>
           <w:rFonts w:ascii="Times New Roman" w:hAnsi="Times New Roman"/>
@@ -5671,7 +5671,7 @@
           <w:sz w:val="28"/>
           <w:szCs w:val="28"/>
         </w:rPr>
-        <w:t xml:space="preserve">двух типов </w:t>
+        <w:t>двух типов</w:t>
       </w:r>
       <w:r>
         <w:rPr>
@@ -5679,7 +5679,23 @@
           <w:sz w:val="28"/>
           <w:szCs w:val="28"/>
         </w:rPr>
-        <w:t>стеков при разных строках-выражениях</w:t>
+        <w:t xml:space="preserve"> очередей</w:t>
+      </w:r>
+      <w:r>
+        <w:rPr>
+          <w:rFonts w:ascii="Times New Roman" w:hAnsi="Times New Roman"/>
+          <w:sz w:val="28"/>
+          <w:szCs w:val="28"/>
+        </w:rPr>
+        <w:t xml:space="preserve"> при разных </w:t>
+      </w:r>
+      <w:r>
+        <w:rPr>
+          <w:rFonts w:ascii="Times New Roman" w:hAnsi="Times New Roman"/>
+          <w:sz w:val="28"/>
+          <w:szCs w:val="28"/>
+        </w:rPr>
+        <w:t>операциях над ними</w:t>
       </w:r>
       <w:bookmarkEnd w:id="16"/>
     </w:p>
@@ -7766,7 +7782,7 @@
           <w:szCs w:val="28"/>
         </w:rPr>
       </w:pPr>
-      <w:bookmarkStart w:id="17" w:name="_Toc120448069"/>
+      <w:bookmarkStart w:id="17" w:name="_Toc120484675"/>
       <w:r>
         <w:rPr>
           <w:rFonts w:ascii="Times New Roman" w:hAnsi="Times New Roman"/>
@@ -7852,6 +7868,12 @@
       <w:r>
         <w:t>Таким образом, можно сделать вывод, что при данной реализации очередей программисту самому необходимо</w:t>
       </w:r>
+      <w:r>
+        <w:t xml:space="preserve"> выбирать структуры данных</w:t>
+      </w:r>
+      <w:r>
+        <w:t>, наиболее подходящие под конкретные задачи.</w:t>
+      </w:r>
     </w:p>
     <w:p>
       <w:pPr>
@@ -7863,7 +7885,7 @@
           <w:szCs w:val="28"/>
         </w:rPr>
       </w:pPr>
-      <w:bookmarkStart w:id="18" w:name="_Toc120448070"/>
+      <w:bookmarkStart w:id="18" w:name="_Toc120484676"/>
       <w:r>
         <w:rPr>
           <w:rFonts w:ascii="Times New Roman" w:hAnsi="Times New Roman"/>
@@ -8101,6 +8123,7 @@
         </w:numPr>
       </w:pPr>
       <w:r>
+        <w:lastRenderedPageBreak/>
         <w:t>Возможно переполнение</w:t>
       </w:r>
     </w:p>
@@ -8113,7 +8136,6 @@
         </w:numPr>
       </w:pPr>
       <w:r>
-        <w:lastRenderedPageBreak/>
         <w:t>Особенности при реализации списком</w:t>
       </w:r>
       <w:r>

</xml_diff>